<commit_message>
Add SQA test execution evidence
</commit_message>
<xml_diff>
--- a/docs/sqa/Plan_SQA_Agil_BolClick.docx
+++ b/docs/sqa/Plan_SQA_Agil_BolClick.docx
@@ -6937,6 +6937,368 @@
           <w:sz w:val="24"/>
         </w:rPr>
         <w:t>• ISTQB. Certified Tester Foundation Level Agile Tester syllabus, v1.0, 2024. https://www.istqb.org/wp-content/uploads/2024/11/ISTQB-CTFL-AT_Syllabus_v1.0.pdf</w:t>
+      </w:r>
+    </w:p>
+    <w:p>
+      <w:r>
+        <w:br w:type="page"/>
+      </w:r>
+    </w:p>
+    <w:p>
+      <w:pPr>
+        <w:pStyle w:val="Ttulo1"/>
+        <w:spacing w:before="0" w:after="160"/>
+      </w:pPr>
+      <w:r>
+        <w:rPr>
+          <w:rFonts w:ascii="Arial" w:hAnsi="Arial"/>
+          <w:b/>
+          <w:i w:val="0"/>
+          <w:color w:val="000000"/>
+          <w:sz w:val="28"/>
+        </w:rPr>
+        <w:t>Evidencias visuales de pruebas</w:t>
+      </w:r>
+    </w:p>
+    <w:p>
+      <w:r>
+        <w:rPr>
+          <w:rFonts w:ascii="Arial" w:hAnsi="Arial"/>
+          <w:i w:val="0"/>
+          <w:color w:val="000000"/>
+          <w:sz w:val="24"/>
+        </w:rPr>
+        <w:t>Las figuras muestran el resultado de la ejecución local de Jest, extractos de pruebas presentes en el repositorio y el registro de verificaciones manuales. Las pruebas de código corresponden a la suite que aprobó 30 de 30 casos en cuatro suites. Los extractos muestran el contenido de los casos y no son resultados individuales. La verificación manual se identifica como registro visual, no como captura directa del navegador. Cypress permanece pendiente de su primera ejecución satisfactoria en CI.</w:t>
+      </w:r>
+    </w:p>
+    <w:p>
+      <w:pPr>
+        <w:spacing w:before="60" w:after="40"/>
+        <w:jc w:val="center"/>
+      </w:pPr>
+      <w:r>
+        <w:drawing>
+          <wp:inline xmlns:a="http://schemas.openxmlformats.org/drawingml/2006/main" xmlns:pic="http://schemas.openxmlformats.org/drawingml/2006/picture">
+            <wp:extent cx="5623560" cy="1782999"/>
+            <wp:docPr id="1" name="Picture 1"/>
+            <wp:cNvGraphicFramePr>
+              <a:graphicFrameLocks noChangeAspect="1"/>
+            </wp:cNvGraphicFramePr>
+            <a:graphic>
+              <a:graphicData uri="http://schemas.openxmlformats.org/drawingml/2006/picture">
+                <pic:pic>
+                  <pic:nvPicPr>
+                    <pic:cNvPr id="0" name="image.png"/>
+                    <pic:cNvPicPr/>
+                  </pic:nvPicPr>
+                  <pic:blipFill>
+                    <a:blip r:embed="rId16"/>
+                    <a:stretch>
+                      <a:fillRect/>
+                    </a:stretch>
+                  </pic:blipFill>
+                  <pic:spPr>
+                    <a:xfrm>
+                      <a:off x="0" y="0"/>
+                      <a:ext cx="5623560" cy="1782999"/>
+                    </a:xfrm>
+                    <a:prstGeom prst="rect"/>
+                  </pic:spPr>
+                </pic:pic>
+              </a:graphicData>
+            </a:graphic>
+          </wp:inline>
+        </w:drawing>
+      </w:r>
+    </w:p>
+    <w:p>
+      <w:pPr>
+        <w:spacing w:after="140"/>
+        <w:jc w:val="center"/>
+      </w:pPr>
+      <w:r>
+        <w:rPr>
+          <w:rFonts w:ascii="Arial" w:hAnsi="Arial"/>
+          <w:i w:val="0"/>
+          <w:color w:val="000000"/>
+          <w:sz w:val="24"/>
+        </w:rPr>
+        <w:t>Figura 1. Salida real de Jest: 4 suites y 30 pruebas aprobadas.</w:t>
+      </w:r>
+    </w:p>
+    <w:p>
+      <w:pPr>
+        <w:spacing w:before="60" w:after="40"/>
+        <w:jc w:val="center"/>
+      </w:pPr>
+      <w:r>
+        <w:drawing>
+          <wp:inline xmlns:a="http://schemas.openxmlformats.org/drawingml/2006/main" xmlns:pic="http://schemas.openxmlformats.org/drawingml/2006/picture">
+            <wp:extent cx="5623560" cy="2292428"/>
+            <wp:docPr id="2" name="Picture 2"/>
+            <wp:cNvGraphicFramePr>
+              <a:graphicFrameLocks noChangeAspect="1"/>
+            </wp:cNvGraphicFramePr>
+            <a:graphic>
+              <a:graphicData uri="http://schemas.openxmlformats.org/drawingml/2006/picture">
+                <pic:pic>
+                  <pic:nvPicPr>
+                    <pic:cNvPr id="0" name="image.png"/>
+                    <pic:cNvPicPr/>
+                  </pic:nvPicPr>
+                  <pic:blipFill>
+                    <a:blip r:embed="rId15"/>
+                    <a:stretch>
+                      <a:fillRect/>
+                    </a:stretch>
+                  </pic:blipFill>
+                  <pic:spPr>
+                    <a:xfrm>
+                      <a:off x="0" y="0"/>
+                      <a:ext cx="5623560" cy="2292428"/>
+                    </a:xfrm>
+                    <a:prstGeom prst="rect"/>
+                  </pic:spPr>
+                </pic:pic>
+              </a:graphicData>
+            </a:graphic>
+          </wp:inline>
+        </w:drawing>
+      </w:r>
+    </w:p>
+    <w:p>
+      <w:pPr>
+        <w:spacing w:after="140"/>
+        <w:jc w:val="center"/>
+      </w:pPr>
+      <w:r>
+        <w:rPr>
+          <w:rFonts w:ascii="Arial" w:hAnsi="Arial"/>
+          <w:i w:val="0"/>
+          <w:color w:val="000000"/>
+          <w:sz w:val="24"/>
+        </w:rPr>
+        <w:t>Figura 2. Extracto de prueba unitaria para correlativos de venta.</w:t>
+      </w:r>
+    </w:p>
+    <w:p>
+      <w:pPr>
+        <w:spacing w:before="60" w:after="40"/>
+        <w:jc w:val="center"/>
+      </w:pPr>
+      <w:r>
+        <w:drawing>
+          <wp:inline xmlns:a="http://schemas.openxmlformats.org/drawingml/2006/main" xmlns:pic="http://schemas.openxmlformats.org/drawingml/2006/picture">
+            <wp:extent cx="5623560" cy="2064177"/>
+            <wp:docPr id="3" name="Picture 3"/>
+            <wp:cNvGraphicFramePr>
+              <a:graphicFrameLocks noChangeAspect="1"/>
+            </wp:cNvGraphicFramePr>
+            <a:graphic>
+              <a:graphicData uri="http://schemas.openxmlformats.org/drawingml/2006/picture">
+                <pic:pic>
+                  <pic:nvPicPr>
+                    <pic:cNvPr id="0" name="image.png"/>
+                    <pic:cNvPicPr/>
+                  </pic:nvPicPr>
+                  <pic:blipFill>
+                    <a:blip r:embed="rId13"/>
+                    <a:stretch>
+                      <a:fillRect/>
+                    </a:stretch>
+                  </pic:blipFill>
+                  <pic:spPr>
+                    <a:xfrm>
+                      <a:off x="0" y="0"/>
+                      <a:ext cx="5623560" cy="2064177"/>
+                    </a:xfrm>
+                    <a:prstGeom prst="rect"/>
+                  </pic:spPr>
+                </pic:pic>
+              </a:graphicData>
+            </a:graphic>
+          </wp:inline>
+        </w:drawing>
+      </w:r>
+    </w:p>
+    <w:p>
+      <w:pPr>
+        <w:spacing w:after="140"/>
+        <w:jc w:val="center"/>
+      </w:pPr>
+      <w:r>
+        <w:rPr>
+          <w:rFonts w:ascii="Arial" w:hAnsi="Arial"/>
+          <w:i w:val="0"/>
+          <w:color w:val="000000"/>
+          <w:sz w:val="24"/>
+        </w:rPr>
+        <w:t>Figura 3. Registro visual de comprobaciones manuales de interfaz.</w:t>
+      </w:r>
+    </w:p>
+    <w:p>
+      <w:pPr>
+        <w:spacing w:before="60" w:after="40"/>
+        <w:jc w:val="center"/>
+      </w:pPr>
+      <w:r>
+        <w:drawing>
+          <wp:inline xmlns:a="http://schemas.openxmlformats.org/drawingml/2006/main" xmlns:pic="http://schemas.openxmlformats.org/drawingml/2006/picture">
+            <wp:extent cx="5623560" cy="2735697"/>
+            <wp:docPr id="4" name="Picture 4"/>
+            <wp:cNvGraphicFramePr>
+              <a:graphicFrameLocks noChangeAspect="1"/>
+            </wp:cNvGraphicFramePr>
+            <a:graphic>
+              <a:graphicData uri="http://schemas.openxmlformats.org/drawingml/2006/picture">
+                <pic:pic>
+                  <pic:nvPicPr>
+                    <pic:cNvPr id="0" name="image.png"/>
+                    <pic:cNvPicPr/>
+                  </pic:nvPicPr>
+                  <pic:blipFill>
+                    <a:blip r:embed="rId17"/>
+                    <a:stretch>
+                      <a:fillRect/>
+                    </a:stretch>
+                  </pic:blipFill>
+                  <pic:spPr>
+                    <a:xfrm>
+                      <a:off x="0" y="0"/>
+                      <a:ext cx="5623560" cy="2735697"/>
+                    </a:xfrm>
+                    <a:prstGeom prst="rect"/>
+                  </pic:spPr>
+                </pic:pic>
+              </a:graphicData>
+            </a:graphic>
+          </wp:inline>
+        </w:drawing>
+      </w:r>
+    </w:p>
+    <w:p>
+      <w:pPr>
+        <w:spacing w:after="140"/>
+        <w:jc w:val="center"/>
+      </w:pPr>
+      <w:r>
+        <w:rPr>
+          <w:rFonts w:ascii="Arial" w:hAnsi="Arial"/>
+          <w:i w:val="0"/>
+          <w:color w:val="000000"/>
+          <w:sz w:val="24"/>
+        </w:rPr>
+        <w:t>Figura 4. Caso de inventario que verifica stock y movimiento dentro de la misma transacción.</w:t>
+      </w:r>
+    </w:p>
+    <w:p>
+      <w:pPr>
+        <w:spacing w:before="60" w:after="40"/>
+        <w:jc w:val="center"/>
+      </w:pPr>
+      <w:r>
+        <w:drawing>
+          <wp:inline xmlns:a="http://schemas.openxmlformats.org/drawingml/2006/main" xmlns:pic="http://schemas.openxmlformats.org/drawingml/2006/picture">
+            <wp:extent cx="5623560" cy="2629841"/>
+            <wp:docPr id="5" name="Picture 5"/>
+            <wp:cNvGraphicFramePr>
+              <a:graphicFrameLocks noChangeAspect="1"/>
+            </wp:cNvGraphicFramePr>
+            <a:graphic>
+              <a:graphicData uri="http://schemas.openxmlformats.org/drawingml/2006/picture">
+                <pic:pic>
+                  <pic:nvPicPr>
+                    <pic:cNvPr id="0" name="image.png"/>
+                    <pic:cNvPicPr/>
+                  </pic:nvPicPr>
+                  <pic:blipFill>
+                    <a:blip r:embed="rId18"/>
+                    <a:stretch>
+                      <a:fillRect/>
+                    </a:stretch>
+                  </pic:blipFill>
+                  <pic:spPr>
+                    <a:xfrm>
+                      <a:off x="0" y="0"/>
+                      <a:ext cx="5623560" cy="2629841"/>
+                    </a:xfrm>
+                    <a:prstGeom prst="rect"/>
+                  </pic:spPr>
+                </pic:pic>
+              </a:graphicData>
+            </a:graphic>
+          </wp:inline>
+        </w:drawing>
+      </w:r>
+    </w:p>
+    <w:p>
+      <w:pPr>
+        <w:spacing w:after="140"/>
+        <w:jc w:val="center"/>
+      </w:pPr>
+      <w:r>
+        <w:rPr>
+          <w:rFonts w:ascii="Arial" w:hAnsi="Arial"/>
+          <w:i w:val="0"/>
+          <w:color w:val="000000"/>
+          <w:sz w:val="24"/>
+        </w:rPr>
+        <w:t>Figura 5. Caso que rechaza una salida que dejaría el inventario negativo.</w:t>
+      </w:r>
+    </w:p>
+    <w:p>
+      <w:pPr>
+        <w:spacing w:before="60" w:after="40"/>
+        <w:jc w:val="center"/>
+      </w:pPr>
+      <w:r>
+        <w:drawing>
+          <wp:inline xmlns:a="http://schemas.openxmlformats.org/drawingml/2006/main" xmlns:pic="http://schemas.openxmlformats.org/drawingml/2006/picture">
+            <wp:extent cx="5623560" cy="4429380"/>
+            <wp:docPr id="6" name="Picture 6"/>
+            <wp:cNvGraphicFramePr>
+              <a:graphicFrameLocks noChangeAspect="1"/>
+            </wp:cNvGraphicFramePr>
+            <a:graphic>
+              <a:graphicData uri="http://schemas.openxmlformats.org/drawingml/2006/picture">
+                <pic:pic>
+                  <pic:nvPicPr>
+                    <pic:cNvPr id="0" name="06_prueba_venta_sin_stock.png"/>
+                    <pic:cNvPicPr/>
+                  </pic:nvPicPr>
+                  <pic:blipFill>
+                    <a:blip r:embed="rId20"/>
+                    <a:stretch>
+                      <a:fillRect/>
+                    </a:stretch>
+                  </pic:blipFill>
+                  <pic:spPr>
+                    <a:xfrm>
+                      <a:off x="0" y="0"/>
+                      <a:ext cx="5623560" cy="4429380"/>
+                    </a:xfrm>
+                    <a:prstGeom prst="rect"/>
+                  </pic:spPr>
+                </pic:pic>
+              </a:graphicData>
+            </a:graphic>
+          </wp:inline>
+        </w:drawing>
+      </w:r>
+    </w:p>
+    <w:p>
+      <w:pPr>
+        <w:spacing w:after="140"/>
+        <w:jc w:val="center"/>
+      </w:pPr>
+      <w:r>
+        <w:rPr>
+          <w:rFonts w:ascii="Arial" w:hAnsi="Arial"/>
+          <w:i w:val="0"/>
+          <w:color w:val="000000"/>
+          <w:sz w:val="24"/>
+        </w:rPr>
+        <w:t>Figura 6. Caso de venta que rechaza una cantidad superior al stock disponible.</w:t>
       </w:r>
     </w:p>
     <w:sectPr>

</xml_diff>